<commit_message>
create real Finova onboarding workflow
</commit_message>
<xml_diff>
--- a/docs/FSCA Compliance/BitWealth_LTH_PVR_Client_Addendum_v1.0.docx
+++ b/docs/FSCA Compliance/BitWealth_LTH_PVR_Client_Addendum_v1.0.docx
@@ -360,7 +360,7 @@
         <w:rPr>
           <w:color w:val="1A1A1A"/>
         </w:rPr>
-        <w:t>b</w:t>
+        <w:t xml:space="preserve"> </w:t>
       </w:r>
       <w:r>
         <w:rPr>
@@ -1692,35 +1692,13 @@
               <w:rPr>
                 <w:color w:val="1A1A1A"/>
               </w:rPr>
-              <w:t>……</w:t>
+              <w:t>………..</w:t>
             </w:r>
-            <w:proofErr w:type="gramStart"/>
             <w:r>
               <w:rPr>
                 <w:color w:val="1A1A1A"/>
               </w:rPr>
-              <w:t>…..</w:t>
-            </w:r>
-            <w:proofErr w:type="gramEnd"/>
-            <w:r>
-              <w:rPr>
-                <w:color w:val="1A1A1A"/>
-              </w:rPr>
-              <w:t xml:space="preserve">  On </w:t>
-            </w:r>
-            <w:proofErr w:type="gramStart"/>
-            <w:r>
-              <w:rPr>
-                <w:color w:val="1A1A1A"/>
-              </w:rPr>
-              <w:t>date:…</w:t>
-            </w:r>
-            <w:proofErr w:type="gramEnd"/>
-            <w:r>
-              <w:rPr>
-                <w:color w:val="1A1A1A"/>
-              </w:rPr>
-              <w:t>……………………</w:t>
+              <w:t xml:space="preserve">  On date:………………………</w:t>
             </w:r>
           </w:p>
         </w:tc>
@@ -13800,10 +13778,6 @@
 </file>
 
 <file path=customXml/item1.xml><?xml version="1.0" encoding="utf-8"?>
-<b:Sources xmlns:b="http://schemas.openxmlformats.org/officeDocument/2006/bibliography" xmlns="http://schemas.openxmlformats.org/officeDocument/2006/bibliography" SelectedStyle="/APA.XSL" StyleName="APA"/>
-</file>
-
-<file path=customXml/item2.xml><?xml version="1.0" encoding="utf-8"?>
 <p:properties xmlns:p="http://schemas.microsoft.com/office/2006/metadata/properties" xmlns:xsi="http://www.w3.org/2001/XMLSchema-instance" xmlns:pc="http://schemas.microsoft.com/office/infopath/2007/PartnerControls">
   <documentManagement>
     <_Flow_SignoffStatus xmlns="d8b47b14-0414-4236-a2bd-633b74c32016" xsi:nil="true"/>
@@ -13815,16 +13789,11 @@
 </p:properties>
 </file>
 
-<file path=customXml/item3.xml><?xml version="1.0" encoding="utf-8"?>
-<?mso-contentType ?>
-<FormTemplates xmlns="http://schemas.microsoft.com/sharepoint/v3/contenttype/forms">
-  <Display>DocumentLibraryForm</Display>
-  <Edit>DocumentLibraryForm</Edit>
-  <New>DocumentLibraryForm</New>
-</FormTemplates>
+<file path=customXml/item2.xml><?xml version="1.0" encoding="utf-8"?>
+<b:Sources xmlns:b="http://schemas.openxmlformats.org/officeDocument/2006/bibliography" xmlns="http://schemas.openxmlformats.org/officeDocument/2006/bibliography" SelectedStyle="/APA.XSL" StyleName="APA"/>
 </file>
 
-<file path=customXml/item4.xml><?xml version="1.0" encoding="utf-8"?>
+<file path=customXml/item3.xml><?xml version="1.0" encoding="utf-8"?>
 <ct:contentTypeSchema xmlns:ct="http://schemas.microsoft.com/office/2006/metadata/contentType" xmlns:ma="http://schemas.microsoft.com/office/2006/metadata/properties/metaAttributes" ct:_="" ma:_="" ma:contentTypeName="Document" ma:contentTypeID="0x01010091D1F28783E1AD49AF23795378FE73D6" ma:contentTypeVersion="21" ma:contentTypeDescription="Create a new document." ma:contentTypeScope="" ma:versionID="7acc3f2bf4491a9385f94f68fd30614d">
   <xsd:schema xmlns:xsd="http://www.w3.org/2001/XMLSchema" xmlns:xs="http://www.w3.org/2001/XMLSchema" xmlns:p="http://schemas.microsoft.com/office/2006/metadata/properties" xmlns:ns2="d8b47b14-0414-4236-a2bd-633b74c32016" xmlns:ns3="fdb76b8b-195f-40b0-a399-f049bd053467" targetNamespace="http://schemas.microsoft.com/office/2006/metadata/properties" ma:root="true" ma:fieldsID="1a6ff7cb118fd42c40e306541858351d" ns2:_="" ns3:_="">
     <xsd:import namespace="d8b47b14-0414-4236-a2bd-633b74c32016"/>
@@ -14085,15 +14054,16 @@
 </ct:contentTypeSchema>
 </file>
 
-<file path=customXml/itemProps1.xml><?xml version="1.0" encoding="utf-8"?>
-<ds:datastoreItem xmlns:ds="http://schemas.openxmlformats.org/officeDocument/2006/customXml" ds:itemID="{EF278816-EC6F-A645-907D-7F25AECB1D4A}">
-  <ds:schemaRefs>
-    <ds:schemaRef ds:uri="http://schemas.openxmlformats.org/officeDocument/2006/bibliography"/>
-  </ds:schemaRefs>
-</ds:datastoreItem>
+<file path=customXml/item4.xml><?xml version="1.0" encoding="utf-8"?>
+<?mso-contentType ?>
+<FormTemplates xmlns="http://schemas.microsoft.com/sharepoint/v3/contenttype/forms">
+  <Display>DocumentLibraryForm</Display>
+  <Edit>DocumentLibraryForm</Edit>
+  <New>DocumentLibraryForm</New>
+</FormTemplates>
 </file>
 
-<file path=customXml/itemProps2.xml><?xml version="1.0" encoding="utf-8"?>
+<file path=customXml/itemProps1.xml><?xml version="1.0" encoding="utf-8"?>
 <ds:datastoreItem xmlns:ds="http://schemas.openxmlformats.org/officeDocument/2006/customXml" ds:itemID="{B891D7E5-59D7-40EE-A6F5-8BB6E863B713}">
   <ds:schemaRefs>
     <ds:schemaRef ds:uri="http://schemas.microsoft.com/office/2006/metadata/properties"/>
@@ -14104,15 +14074,15 @@
 </ds:datastoreItem>
 </file>
 
-<file path=customXml/itemProps3.xml><?xml version="1.0" encoding="utf-8"?>
-<ds:datastoreItem xmlns:ds="http://schemas.openxmlformats.org/officeDocument/2006/customXml" ds:itemID="{AA053E08-E8DC-41AD-AE6E-76FD75ABE24A}">
+<file path=customXml/itemProps2.xml><?xml version="1.0" encoding="utf-8"?>
+<ds:datastoreItem xmlns:ds="http://schemas.openxmlformats.org/officeDocument/2006/customXml" ds:itemID="{EF278816-EC6F-A645-907D-7F25AECB1D4A}">
   <ds:schemaRefs>
-    <ds:schemaRef ds:uri="http://schemas.microsoft.com/sharepoint/v3/contenttype/forms"/>
+    <ds:schemaRef ds:uri="http://schemas.openxmlformats.org/officeDocument/2006/bibliography"/>
   </ds:schemaRefs>
 </ds:datastoreItem>
 </file>
 
-<file path=customXml/itemProps4.xml><?xml version="1.0" encoding="utf-8"?>
+<file path=customXml/itemProps3.xml><?xml version="1.0" encoding="utf-8"?>
 <ds:datastoreItem xmlns:ds="http://schemas.openxmlformats.org/officeDocument/2006/customXml" ds:itemID="{BD2EA42C-5F99-4228-A17C-AC2DBDB50E4D}">
   <ds:schemaRefs>
     <ds:schemaRef ds:uri="http://schemas.microsoft.com/office/2006/metadata/contentType"/>
@@ -14129,4 +14099,12 @@
     <ds:schemaRef ds:uri="http://schemas.microsoft.com/internal/obd"/>
   </ds:schemaRefs>
 </ds:datastoreItem>
+</file>
+
+<file path=customXml/itemProps4.xml><?xml version="1.0" encoding="utf-8"?>
+<ds:datastoreItem xmlns:ds="http://schemas.openxmlformats.org/officeDocument/2006/customXml" ds:itemID="{AA053E08-E8DC-41AD-AE6E-76FD75ABE24A}">
+  <ds:schemaRefs>
+    <ds:schemaRef ds:uri="http://schemas.microsoft.com/sharepoint/v3/contenttype/forms"/>
+  </ds:schemaRefs>
+</ds:datastoreItem>
 </file>
</xml_diff>